<commit_message>
added 6 7 8 lects and startes es3
</commit_message>
<xml_diff>
--- a/lectures/Лекции_кратко.docx
+++ b/lectures/Лекции_кратко.docx
@@ -685,37 +685,62 @@
       </w:r>
     </w:p>
     <w:p>
-      <w:r>
-        <w:t xml:space="preserve">     - </w:t>
+      <w:pPr>
+        <w:rPr>
+          <w:lang w:val="en-US"/>
+        </w:rPr>
+      </w:pPr>
+      <w:r>
+        <w:t xml:space="preserve">     </w:t>
+      </w:r>
+      <w:r>
+        <w:rPr>
+          <w:lang w:val="en-US"/>
+        </w:rPr>
+        <w:t xml:space="preserve">- </w:t>
       </w:r>
       <w:proofErr w:type="gramStart"/>
       <w:r>
-        <w:t>P(X &gt;</w:t>
+        <w:rPr>
+          <w:lang w:val="en-US"/>
+        </w:rPr>
+        <w:t>P(</w:t>
       </w:r>
       <w:proofErr w:type="gramEnd"/>
       <w:r>
-        <w:t xml:space="preserve"> A) ≤ e^(-</w:t>
-      </w:r>
-      <w:proofErr w:type="spellStart"/>
-      <w:r>
-        <w:t>μA</w:t>
-      </w:r>
-      <w:proofErr w:type="spellEnd"/>
-      <w:r>
-        <w:t>) E[e^(</w:t>
-      </w:r>
-      <w:proofErr w:type="spellStart"/>
-      <w:r>
-        <w:t>μX</w:t>
-      </w:r>
-      <w:proofErr w:type="spellEnd"/>
-      <w:r>
-        <w:t>)].</w:t>
-      </w:r>
-    </w:p>
-    <w:p>
-      <w:r>
-        <w:t xml:space="preserve">   - Возможность минимизации результатов по μ для получения сильных границ.</w:t>
+        <w:rPr>
+          <w:lang w:val="en-US"/>
+        </w:rPr>
+        <w:t>X &gt; A) ≤ e^(-</w:t>
+      </w:r>
+      <w:r>
+        <w:t>μ</w:t>
+      </w:r>
+      <w:r>
+        <w:rPr>
+          <w:lang w:val="en-US"/>
+        </w:rPr>
+        <w:t>A) E[e^(</w:t>
+      </w:r>
+      <w:r>
+        <w:t>μ</w:t>
+      </w:r>
+      <w:r>
+        <w:rPr>
+          <w:lang w:val="en-US"/>
+        </w:rPr>
+        <w:t>X)].</w:t>
+      </w:r>
+    </w:p>
+    <w:p>
+      <w:r>
+        <w:rPr>
+          <w:lang w:val="en-US"/>
+        </w:rPr>
+        <w:t xml:space="preserve">   </w:t>
+      </w:r>
+      <w:r>
+        <w:t>- Возможность минимизации результатов по μ для получения сильных границ.</w:t>
       </w:r>
     </w:p>
     <w:p>
@@ -1199,331 +1224,1389 @@
           <w:sz w:val="32"/>
           <w:szCs w:val="32"/>
         </w:rPr>
-        <w:t xml:space="preserve">Лекция </w:t>
-      </w:r>
-      <w:r>
+        <w:t>Лекция 5</w:t>
+      </w:r>
+    </w:p>
+    <w:p>
+      <w:r>
+        <w:rPr>
+          <w:rFonts w:ascii="Segoe UI Symbol" w:hAnsi="Segoe UI Symbol" w:cs="Segoe UI Symbol"/>
+        </w:rPr>
+        <w:t>⁨</w:t>
+      </w:r>
+      <w:r>
+        <w:t xml:space="preserve">1. Введение в </w:t>
+      </w:r>
+      <w:proofErr w:type="spellStart"/>
+      <w:r>
+        <w:t>Хаффмановское</w:t>
+      </w:r>
+      <w:proofErr w:type="spellEnd"/>
+      <w:r>
+        <w:t xml:space="preserve"> кодирование</w:t>
+      </w:r>
+    </w:p>
+    <w:p>
+      <w:r>
+        <w:t xml:space="preserve">   - Описание: Кодирование с использованием большого алфавита, состоящего из M букв с вероятностями P1, P2 и так далее.</w:t>
+      </w:r>
+    </w:p>
+    <w:p>
+      <w:r>
+        <w:t xml:space="preserve">   - Цель</w:t>
+      </w:r>
+      <w:proofErr w:type="gramStart"/>
+      <w:r>
+        <w:t>: Кодировать</w:t>
+      </w:r>
+      <w:proofErr w:type="gramEnd"/>
+      <w:r>
+        <w:t xml:space="preserve"> сообщение в двоичное представление.</w:t>
+      </w:r>
+    </w:p>
+    <w:p>
+      <w:r>
+        <w:t xml:space="preserve">   - Ключевое свойство: Каждой букве соответствует кодовое слово фиксированной длины.</w:t>
+      </w:r>
+    </w:p>
+    <w:p/>
+    <w:p>
+      <w:r>
+        <w:t>2. Средняя длина кодового слова</w:t>
+      </w:r>
+    </w:p>
+    <w:p>
+      <w:r>
+        <w:t xml:space="preserve">   - Определение: Средняя длина кодового слова LJT и его вероятность PJT.</w:t>
+      </w:r>
+    </w:p>
+    <w:p>
+      <w:r>
+        <w:t xml:space="preserve">   - Эффективность кодирования: Средняя длина кодового слова больше или равна энтропии источника H от X.</w:t>
+      </w:r>
+    </w:p>
+    <w:p/>
+    <w:p>
+      <w:r>
+        <w:t>3. Алгоритмы кодирования</w:t>
+      </w:r>
+    </w:p>
+    <w:p>
+      <w:r>
+        <w:t xml:space="preserve">   - Построение префиксного кода:</w:t>
+      </w:r>
+    </w:p>
+    <w:p>
+      <w:r>
+        <w:t xml:space="preserve">     - Упорядочивание вероятностей по возрастанию.</w:t>
+      </w:r>
+    </w:p>
+    <w:p>
+      <w:r>
+        <w:t xml:space="preserve">     - Объединение двух наименее вероятных букв в одну вершину дерева.</w:t>
+      </w:r>
+    </w:p>
+    <w:p>
+      <w:r>
+        <w:t xml:space="preserve">     - Повторение процесса до тех пор, пока не останется одна вершина (корень дерева).</w:t>
+      </w:r>
+    </w:p>
+    <w:p>
+      <w:r>
+        <w:t xml:space="preserve">   - Кодирование сообщения:</w:t>
+      </w:r>
+    </w:p>
+    <w:p>
+      <w:r>
+        <w:lastRenderedPageBreak/>
+        <w:t xml:space="preserve">     - Исходное сообщение сопоставляется с </w:t>
+      </w:r>
+      <w:proofErr w:type="spellStart"/>
+      <w:r>
+        <w:t>концовыми</w:t>
+      </w:r>
+      <w:proofErr w:type="spellEnd"/>
+      <w:r>
+        <w:t xml:space="preserve"> вершинами дерева, чтобы получить кодовое слово.</w:t>
+      </w:r>
+    </w:p>
+    <w:p/>
+    <w:p>
+      <w:r>
+        <w:t>4. Декодирование по Хаффману</w:t>
+      </w:r>
+    </w:p>
+    <w:p>
+      <w:r>
+        <w:t xml:space="preserve">   - Процесс: Получение битового потока, который декодируется путем сопоставления с деревом, восстановление оригинального сообщения.</w:t>
+      </w:r>
+    </w:p>
+    <w:p/>
+    <w:p>
+      <w:r>
+        <w:t xml:space="preserve">5. Обобщение — </w:t>
+      </w:r>
+      <w:proofErr w:type="spellStart"/>
+      <w:r>
+        <w:t>Танстоловское</w:t>
+      </w:r>
+      <w:proofErr w:type="spellEnd"/>
+      <w:r>
+        <w:t xml:space="preserve"> кодирование</w:t>
+      </w:r>
+    </w:p>
+    <w:p>
+      <w:r>
+        <w:t xml:space="preserve">   - Цель</w:t>
+      </w:r>
+      <w:proofErr w:type="gramStart"/>
+      <w:r>
+        <w:t>: Закодировать</w:t>
+      </w:r>
+      <w:proofErr w:type="gramEnd"/>
+      <w:r>
+        <w:t xml:space="preserve"> двоичный входной поток в большой алфавит.</w:t>
+      </w:r>
+    </w:p>
+    <w:p>
+      <w:r>
+        <w:t xml:space="preserve">   - Идея</w:t>
+      </w:r>
+      <w:proofErr w:type="gramStart"/>
+      <w:r>
+        <w:t>: Использовать</w:t>
+      </w:r>
+      <w:proofErr w:type="gramEnd"/>
+      <w:r>
+        <w:t xml:space="preserve"> декодирование Хаффмана как кодирование для новой системы, где входные символы преобразуются в двоичные.</w:t>
+      </w:r>
+    </w:p>
+    <w:p/>
+    <w:p>
+      <w:r>
+        <w:t xml:space="preserve">6. Строительство кода </w:t>
+      </w:r>
+      <w:proofErr w:type="spellStart"/>
+      <w:r>
+        <w:t>Танстола</w:t>
+      </w:r>
+      <w:proofErr w:type="spellEnd"/>
+    </w:p>
+    <w:p>
+      <w:r>
+        <w:t xml:space="preserve">   - Алгоритм</w:t>
+      </w:r>
+      <w:proofErr w:type="gramStart"/>
+      <w:r>
+        <w:t>: Строится</w:t>
+      </w:r>
+      <w:proofErr w:type="gramEnd"/>
+      <w:r>
+        <w:t xml:space="preserve"> дерево с равновероятными выходными символами.</w:t>
+      </w:r>
+    </w:p>
+    <w:p>
+      <w:r>
+        <w:t xml:space="preserve">   - Применение</w:t>
+      </w:r>
+      <w:proofErr w:type="gramStart"/>
+      <w:r>
+        <w:t>: Используется</w:t>
+      </w:r>
+      <w:proofErr w:type="gramEnd"/>
+      <w:r>
+        <w:t xml:space="preserve"> для ситуации, когда необходимо перекодировать данные из менее обширного в более обширное представление.</w:t>
+      </w:r>
+    </w:p>
+    <w:p/>
+    <w:p>
+      <w:r>
+        <w:t>7. Арифметическое кодирование</w:t>
+      </w:r>
+    </w:p>
+    <w:p>
+      <w:r>
+        <w:t xml:space="preserve">   - Основная идея</w:t>
+      </w:r>
+      <w:proofErr w:type="gramStart"/>
+      <w:r>
+        <w:t>: Представлять</w:t>
+      </w:r>
+      <w:proofErr w:type="gramEnd"/>
+      <w:r>
+        <w:t xml:space="preserve"> сообщение как интервал на вещественной оси между 0 и 1.</w:t>
+      </w:r>
+    </w:p>
+    <w:p>
+      <w:r>
+        <w:t xml:space="preserve">   - Стратегия</w:t>
+      </w:r>
+      <w:proofErr w:type="gramStart"/>
+      <w:r>
+        <w:t>: Использовать</w:t>
+      </w:r>
+      <w:proofErr w:type="gramEnd"/>
+      <w:r>
+        <w:t xml:space="preserve"> условные вероятности для дробления интервала на </w:t>
+      </w:r>
+      <w:proofErr w:type="spellStart"/>
+      <w:r>
+        <w:t>подинтервалы</w:t>
+      </w:r>
+      <w:proofErr w:type="spellEnd"/>
+      <w:r>
+        <w:t>.</w:t>
+      </w:r>
+    </w:p>
+    <w:p>
+      <w:r>
+        <w:t xml:space="preserve">   - Метод</w:t>
+      </w:r>
+      <w:proofErr w:type="gramStart"/>
+      <w:r>
+        <w:t>: Передать</w:t>
+      </w:r>
+      <w:proofErr w:type="gramEnd"/>
+      <w:r>
+        <w:t xml:space="preserve"> только номер интервала, где находится зашифрованное сообщение.</w:t>
+      </w:r>
+    </w:p>
+    <w:p/>
+    <w:p>
+      <w:r>
+        <w:t>8. Проблемы и недостатки</w:t>
+      </w:r>
+    </w:p>
+    <w:p>
+      <w:r>
+        <w:t xml:space="preserve">   - Сложности в реализации: Важность точности представления чисел при разбиении интервалов.</w:t>
+      </w:r>
+    </w:p>
+    <w:p>
+      <w:r>
+        <w:t xml:space="preserve">   - Проблема накопления вероятностей</w:t>
+      </w:r>
+      <w:proofErr w:type="gramStart"/>
+      <w:r>
+        <w:t>: Требуется</w:t>
+      </w:r>
+      <w:proofErr w:type="gramEnd"/>
+      <w:r>
+        <w:t xml:space="preserve"> обратная связь о статистической модели источника для обеспечения точности.</w:t>
+      </w:r>
+    </w:p>
+    <w:p>
+      <w:r>
+        <w:t xml:space="preserve">   - Ограничения размера алфавита: Априорное знание о вероятностях критично для успешного сжатия данных.</w:t>
+      </w:r>
+    </w:p>
+    <w:p/>
+    <w:p>
+      <w:r>
+        <w:t>9. Заключение</w:t>
+      </w:r>
+    </w:p>
+    <w:p>
+      <w:r>
+        <w:t xml:space="preserve">   - Использование различных кодировок: Как </w:t>
+      </w:r>
+      <w:proofErr w:type="spellStart"/>
+      <w:r>
+        <w:t>Хаффмановские</w:t>
+      </w:r>
+      <w:proofErr w:type="spellEnd"/>
+      <w:r>
+        <w:t xml:space="preserve">, так и </w:t>
+      </w:r>
+      <w:proofErr w:type="spellStart"/>
+      <w:r>
+        <w:t>Танстоловские</w:t>
+      </w:r>
+      <w:proofErr w:type="spellEnd"/>
+      <w:r>
+        <w:t xml:space="preserve"> коды используются в реальных приложениях.</w:t>
+      </w:r>
+    </w:p>
+    <w:p>
+      <w:r>
+        <w:t xml:space="preserve">   - Актуальность арифметического кодирования: Простота и эффективность в современных алгоритмах сжатия.</w:t>
+      </w:r>
+    </w:p>
+    <w:p>
+      <w:r>
+        <w:t xml:space="preserve">   - Необходимость хорошей статистической модели для обеспечения оптимального кодирования. </w:t>
+      </w:r>
+    </w:p>
+    <w:p/>
+    <w:p>
+      <w:r>
+        <w:t>Очередные темы, связанные с передачей данных по каналу, будут рассмотрены на следующих лекциях.</w:t>
+      </w:r>
+    </w:p>
+    <w:p/>
+    <w:p/>
+    <w:p>
+      <w:pPr>
         <w:rPr>
           <w:rFonts w:cs="Segoe UI Symbol"/>
           <w:sz w:val="32"/>
           <w:szCs w:val="32"/>
         </w:rPr>
-        <w:t>5</w:t>
-      </w:r>
-    </w:p>
-    <w:p>
+      </w:pPr>
+      <w:r>
+        <w:rPr>
+          <w:rFonts w:cs="Segoe UI Symbol"/>
+          <w:sz w:val="32"/>
+          <w:szCs w:val="32"/>
+        </w:rPr>
+        <w:t xml:space="preserve">Лекция </w:t>
+      </w:r>
+      <w:r>
+        <w:rPr>
+          <w:rFonts w:cs="Segoe UI Symbol"/>
+          <w:sz w:val="32"/>
+          <w:szCs w:val="32"/>
+        </w:rPr>
+        <w:t>6</w:t>
+      </w:r>
+    </w:p>
+    <w:p>
+      <w:r>
+        <w:rPr>
+          <w:rFonts w:ascii="Calibri" w:hAnsi="Calibri" w:cs="Calibri"/>
+        </w:rPr>
+        <w:t>•</w:t>
+      </w:r>
+      <w:r>
+        <w:t xml:space="preserve"> Введение в тему</w:t>
+      </w:r>
+    </w:p>
+    <w:p>
+      <w:r>
+        <w:t>– Начало лекции с объяснения важности понимания условной вероятности и энтропии.</w:t>
+      </w:r>
+    </w:p>
+    <w:p>
+      <w:r>
+        <w:t>– Переход от теории вероятностей к практическим приложениям в кодировании.</w:t>
+      </w:r>
+    </w:p>
+    <w:p/>
+    <w:p>
+      <w:r>
+        <w:t>• Условная вероятность</w:t>
+      </w:r>
+    </w:p>
+    <w:p>
+      <w:r>
+        <w:t>– Определение условной вероятности и её связь с вероятностным пространством.</w:t>
+      </w:r>
+    </w:p>
+    <w:p>
+      <w:r>
+        <w:t>– Необходимость нормирования вероятности после наступления события для изменения пространства.</w:t>
+      </w:r>
+    </w:p>
+    <w:p>
+      <w:r>
+        <w:t xml:space="preserve">  </w:t>
+      </w:r>
+    </w:p>
+    <w:p>
+      <w:r>
+        <w:t>• Статистическая зависимость</w:t>
+      </w:r>
+    </w:p>
+    <w:p>
+      <w:r>
+        <w:t>– Пояснение зависимости двух случайных величин X и Y.</w:t>
+      </w:r>
+    </w:p>
+    <w:p>
+      <w:r>
+        <w:t>– Обсуждение совместной вероятности и её вычисления.</w:t>
+      </w:r>
+    </w:p>
+    <w:p/>
+    <w:p>
+      <w:r>
+        <w:t>• Энтропия</w:t>
+      </w:r>
+    </w:p>
+    <w:p>
+      <w:r>
+        <w:t>– Определение энтропии как меры неопределенности случайной величины.</w:t>
+      </w:r>
+    </w:p>
+    <w:p>
+      <w:r>
+        <w:t>– Условная энтропия как среднее значение неопределенности для заданного состояния другой величины.</w:t>
+      </w:r>
+    </w:p>
+    <w:p/>
+    <w:p>
+      <w:r>
+        <w:t>• Цепные правила</w:t>
+      </w:r>
+    </w:p>
+    <w:p>
+      <w:r>
+        <w:t>– Цепное правило для случайных величин, выражающее совместное распределение через маргинальные и условные вероятности.</w:t>
+      </w:r>
+    </w:p>
+    <w:p>
+      <w:r>
+        <w:t>– Правила для расчетов энтропии с использованием цепных правил.</w:t>
+      </w:r>
+    </w:p>
+    <w:p/>
+    <w:p>
+      <w:r>
+        <w:t>• Взаимная информация</w:t>
+      </w:r>
+    </w:p>
+    <w:p>
+      <w:r>
+        <w:t>– Введение понятия взаимной информации и её интерпретация как меры улучшения осведомленности.</w:t>
+      </w:r>
+    </w:p>
+    <w:p>
+      <w:r>
+        <w:t>– Связь между взаимной информацией и энтропией: взаимная информация равна разности между общей энтропией и условной.</w:t>
+      </w:r>
+    </w:p>
+    <w:p/>
+    <w:p>
+      <w:r>
+        <w:t>• Связь с каналами связи</w:t>
+      </w:r>
+    </w:p>
+    <w:p>
+      <w:r>
+        <w:t>– Применение теории информации к анализу каналов передачи данных.</w:t>
+      </w:r>
+    </w:p>
+    <w:p>
+      <w:r>
+        <w:t>– Обсуждение, как взаимная информация отражает качество канала и пропускную способность.</w:t>
+      </w:r>
+    </w:p>
+    <w:p/>
+    <w:p>
+      <w:r>
+        <w:t>• Заключение</w:t>
+      </w:r>
+    </w:p>
+    <w:p>
+      <w:r>
+        <w:t>– Резюме основных тем лекции, подчеркивание важности понимания взаимной информации в теории информации.</w:t>
+      </w:r>
+    </w:p>
+    <w:p>
+      <w:pPr>
+        <w:rPr>
+          <w:rFonts w:cs="Segoe UI Symbol"/>
+        </w:rPr>
+      </w:pPr>
+      <w:r>
+        <w:t>– Переход к практическим задачам и будущим темам, связанным с структурой данных и каналами связи.</w:t>
+      </w:r>
       <w:r>
         <w:rPr>
           <w:rFonts w:ascii="Segoe UI Symbol" w:hAnsi="Segoe UI Symbol" w:cs="Segoe UI Symbol"/>
         </w:rPr>
-        <w:t>⁨</w:t>
-      </w:r>
-      <w:r>
-        <w:t xml:space="preserve">1. Введение в </w:t>
+        <w:t>⁩</w:t>
+      </w:r>
+    </w:p>
+    <w:p>
+      <w:pPr>
+        <w:rPr>
+          <w:rFonts w:cs="Segoe UI Symbol"/>
+        </w:rPr>
+      </w:pPr>
+    </w:p>
+    <w:p>
+      <w:pPr>
+        <w:rPr>
+          <w:rFonts w:cs="Segoe UI Symbol"/>
+          <w:sz w:val="32"/>
+          <w:szCs w:val="32"/>
+        </w:rPr>
+      </w:pPr>
+      <w:r>
+        <w:rPr>
+          <w:rFonts w:cs="Segoe UI Symbol"/>
+          <w:sz w:val="32"/>
+          <w:szCs w:val="32"/>
+        </w:rPr>
+        <w:t xml:space="preserve">Лекция </w:t>
+      </w:r>
+      <w:r>
+        <w:rPr>
+          <w:rFonts w:cs="Segoe UI Symbol"/>
+          <w:sz w:val="32"/>
+          <w:szCs w:val="32"/>
+        </w:rPr>
+        <w:t>7</w:t>
+      </w:r>
+    </w:p>
+    <w:p>
+      <w:pPr>
+        <w:rPr>
+          <w:rFonts w:cs="Segoe UI Symbol"/>
+        </w:rPr>
+      </w:pPr>
+    </w:p>
+    <w:p>
+      <w:pPr>
+        <w:rPr>
+          <w:rFonts w:cs="Segoe UI Symbol"/>
+        </w:rPr>
+      </w:pPr>
+      <w:r>
+        <w:rPr>
+          <w:rFonts w:cs="Segoe UI Symbol"/>
+        </w:rPr>
+        <w:t>• Основы кодирования</w:t>
+      </w:r>
+    </w:p>
+    <w:p>
+      <w:pPr>
+        <w:rPr>
+          <w:rFonts w:cs="Segoe UI Symbol"/>
+        </w:rPr>
+      </w:pPr>
+      <w:r>
+        <w:rPr>
+          <w:rFonts w:cs="Segoe UI Symbol"/>
+        </w:rPr>
+        <w:t>– Рассмотрение канала с входом X и выходом Y</w:t>
+      </w:r>
+    </w:p>
+    <w:p>
+      <w:pPr>
+        <w:rPr>
+          <w:rFonts w:cs="Segoe UI Symbol"/>
+        </w:rPr>
+      </w:pPr>
+      <w:r>
+        <w:rPr>
+          <w:rFonts w:cs="Segoe UI Symbol"/>
+        </w:rPr>
+        <w:t>– Задание распределения вероятностей P(Y|X)</w:t>
+      </w:r>
+    </w:p>
+    <w:p>
+      <w:pPr>
+        <w:rPr>
+          <w:rFonts w:cs="Segoe UI Symbol"/>
+        </w:rPr>
+      </w:pPr>
+      <w:r>
+        <w:rPr>
+          <w:rFonts w:cs="Segoe UI Symbol"/>
+        </w:rPr>
+        <w:t>• Совместные и маргинальные распределения</w:t>
+      </w:r>
+    </w:p>
+    <w:p>
+      <w:pPr>
+        <w:rPr>
+          <w:rFonts w:cs="Segoe UI Symbol"/>
+        </w:rPr>
+      </w:pPr>
+      <w:r>
+        <w:rPr>
+          <w:rFonts w:cs="Segoe UI Symbol"/>
+        </w:rPr>
+        <w:t>– Формирование совместного распределения P(</w:t>
+      </w:r>
+      <w:proofErr w:type="gramStart"/>
+      <w:r>
+        <w:rPr>
+          <w:rFonts w:cs="Segoe UI Symbol"/>
+        </w:rPr>
+        <w:t>X,Y</w:t>
+      </w:r>
+      <w:proofErr w:type="gramEnd"/>
+      <w:r>
+        <w:rPr>
+          <w:rFonts w:cs="Segoe UI Symbol"/>
+        </w:rPr>
+        <w:t>) как произведение P(X) и P(Y|X)</w:t>
+      </w:r>
+    </w:p>
+    <w:p>
+      <w:pPr>
+        <w:rPr>
+          <w:rFonts w:cs="Segoe UI Symbol"/>
+        </w:rPr>
+      </w:pPr>
+      <w:r>
+        <w:rPr>
+          <w:rFonts w:cs="Segoe UI Symbol"/>
+        </w:rPr>
+        <w:t>– Определение маргинальных распределений P(X) и P(Y)</w:t>
+      </w:r>
+    </w:p>
+    <w:p>
+      <w:pPr>
+        <w:rPr>
+          <w:rFonts w:cs="Segoe UI Symbol"/>
+        </w:rPr>
+      </w:pPr>
+      <w:r>
+        <w:rPr>
+          <w:rFonts w:cs="Segoe UI Symbol"/>
+        </w:rPr>
+        <w:t>• Взаимная информация</w:t>
+      </w:r>
+    </w:p>
+    <w:p>
+      <w:pPr>
+        <w:rPr>
+          <w:rFonts w:cs="Segoe UI Symbol"/>
+        </w:rPr>
+      </w:pPr>
+      <w:r>
+        <w:rPr>
+          <w:rFonts w:cs="Segoe UI Symbol"/>
+        </w:rPr>
+        <w:t>– Мера зависимости между случайными величинами X и Y</w:t>
+      </w:r>
+    </w:p>
+    <w:p>
+      <w:pPr>
+        <w:rPr>
+          <w:rFonts w:cs="Segoe UI Symbol"/>
+        </w:rPr>
+      </w:pPr>
+      <w:r>
+        <w:rPr>
+          <w:rFonts w:cs="Segoe UI Symbol"/>
+        </w:rPr>
+        <w:t>– Определение как информационной дивергенции между совместным и маргинальными распределениями</w:t>
+      </w:r>
+    </w:p>
+    <w:p>
+      <w:pPr>
+        <w:rPr>
+          <w:rFonts w:cs="Segoe UI Symbol"/>
+        </w:rPr>
+      </w:pPr>
+      <w:r>
+        <w:rPr>
+          <w:rFonts w:cs="Segoe UI Symbol"/>
+        </w:rPr>
+        <w:t>– Три интерпретации взаимной информации через энтропию</w:t>
+      </w:r>
+    </w:p>
+    <w:p>
+      <w:pPr>
+        <w:rPr>
+          <w:rFonts w:cs="Segoe UI Symbol"/>
+        </w:rPr>
+      </w:pPr>
+      <w:r>
+        <w:rPr>
+          <w:rFonts w:cs="Segoe UI Symbol"/>
+        </w:rPr>
+        <w:t>• Энтропия и ее свойства</w:t>
+      </w:r>
+    </w:p>
+    <w:p>
+      <w:pPr>
+        <w:rPr>
+          <w:rFonts w:cs="Segoe UI Symbol"/>
+        </w:rPr>
+      </w:pPr>
+      <w:r>
+        <w:rPr>
+          <w:rFonts w:cs="Segoe UI Symbol"/>
+        </w:rPr>
+        <w:t>– Энтропия как мера неопределенности</w:t>
+      </w:r>
+    </w:p>
+    <w:p>
+      <w:pPr>
+        <w:rPr>
+          <w:rFonts w:cs="Segoe UI Symbol"/>
+        </w:rPr>
+      </w:pPr>
+      <w:r>
+        <w:rPr>
+          <w:rFonts w:cs="Segoe UI Symbol"/>
+        </w:rPr>
+        <w:t>– Связь между энтропией, взаимной информацией и вероятностными условиями</w:t>
+      </w:r>
+    </w:p>
+    <w:p>
+      <w:pPr>
+        <w:rPr>
+          <w:rFonts w:cs="Segoe UI Symbol"/>
+        </w:rPr>
+      </w:pPr>
+      <w:r>
+        <w:rPr>
+          <w:rFonts w:cs="Segoe UI Symbol"/>
+        </w:rPr>
+        <w:t>• Пропускная способность канала</w:t>
+      </w:r>
+    </w:p>
+    <w:p>
+      <w:pPr>
+        <w:rPr>
+          <w:rFonts w:cs="Segoe UI Symbol"/>
+        </w:rPr>
+      </w:pPr>
+      <w:r>
+        <w:rPr>
+          <w:rFonts w:cs="Segoe UI Symbol"/>
+        </w:rPr>
+        <w:t>– Максимизация взаимной информации по всем распределениям на входах</w:t>
+      </w:r>
+    </w:p>
+    <w:p>
+      <w:pPr>
+        <w:rPr>
+          <w:rFonts w:cs="Segoe UI Symbol"/>
+        </w:rPr>
+      </w:pPr>
+      <w:r>
+        <w:rPr>
+          <w:rFonts w:cs="Segoe UI Symbol"/>
+        </w:rPr>
+        <w:t>– Связь с предельной скоростью передачи данных: передача ниже пропускной способности возможна без ошибок</w:t>
+      </w:r>
+    </w:p>
+    <w:p>
+      <w:pPr>
+        <w:rPr>
+          <w:rFonts w:cs="Segoe UI Symbol"/>
+        </w:rPr>
+      </w:pPr>
+      <w:r>
+        <w:rPr>
+          <w:rFonts w:cs="Segoe UI Symbol"/>
+        </w:rPr>
+        <w:t>• Параллельные и последовательные соединения каналов</w:t>
+      </w:r>
+    </w:p>
+    <w:p>
+      <w:pPr>
+        <w:rPr>
+          <w:rFonts w:cs="Segoe UI Symbol"/>
+        </w:rPr>
+      </w:pPr>
+      <w:r>
+        <w:rPr>
+          <w:rFonts w:cs="Segoe UI Symbol"/>
+        </w:rPr>
+        <w:t>– Параллельное соединение увеличивает пропускную способность как сумму индивидуальных способностей</w:t>
+      </w:r>
+    </w:p>
+    <w:p>
+      <w:pPr>
+        <w:rPr>
+          <w:rFonts w:cs="Segoe UI Symbol"/>
+        </w:rPr>
+      </w:pPr>
+      <w:r>
+        <w:rPr>
+          <w:rFonts w:cs="Segoe UI Symbol"/>
+        </w:rPr>
+        <w:lastRenderedPageBreak/>
+        <w:t>– Последовательное соединение ухудшает взаимную информацию</w:t>
+      </w:r>
+    </w:p>
+    <w:p>
+      <w:pPr>
+        <w:rPr>
+          <w:rFonts w:cs="Segoe UI Symbol"/>
+        </w:rPr>
+      </w:pPr>
+      <w:r>
+        <w:rPr>
+          <w:rFonts w:cs="Segoe UI Symbol"/>
+        </w:rPr>
+        <w:t>• Абсолютная стойкость шифрования</w:t>
+      </w:r>
+    </w:p>
+    <w:p>
+      <w:pPr>
+        <w:rPr>
+          <w:rFonts w:cs="Segoe UI Symbol"/>
+        </w:rPr>
+      </w:pPr>
+      <w:r>
+        <w:rPr>
+          <w:rFonts w:cs="Segoe UI Symbol"/>
+        </w:rPr>
+        <w:t xml:space="preserve">– Эффект зависимости между сообщением и </w:t>
       </w:r>
       <w:proofErr w:type="spellStart"/>
       <w:r>
-        <w:t>Хаффмановское</w:t>
+        <w:rPr>
+          <w:rFonts w:cs="Segoe UI Symbol"/>
+        </w:rPr>
+        <w:t>шифротекстом</w:t>
       </w:r>
       <w:proofErr w:type="spellEnd"/>
-      <w:r>
-        <w:t xml:space="preserve"> кодирование</w:t>
-      </w:r>
-    </w:p>
-    <w:p>
-      <w:r>
-        <w:t xml:space="preserve">   - Описание: Кодирование с использованием большого алфавита, состоящего из M букв с вероятностями P1, P2 и так далее.</w:t>
-      </w:r>
-    </w:p>
-    <w:p>
-      <w:r>
-        <w:t xml:space="preserve">   - Цель</w:t>
+    </w:p>
+    <w:p>
+      <w:pPr>
+        <w:rPr>
+          <w:rFonts w:cs="Segoe UI Symbol"/>
+        </w:rPr>
+      </w:pPr>
+      <w:r>
+        <w:rPr>
+          <w:rFonts w:cs="Segoe UI Symbol"/>
+        </w:rPr>
+        <w:t>– Условия для надежного шифрования: энтропия ключа должна превышать энтропию сообщения</w:t>
+      </w:r>
+    </w:p>
+    <w:p>
+      <w:pPr>
+        <w:rPr>
+          <w:rFonts w:cs="Segoe UI Symbol"/>
+        </w:rPr>
+      </w:pPr>
+      <w:r>
+        <w:rPr>
+          <w:rFonts w:cs="Segoe UI Symbol"/>
+        </w:rPr>
+        <w:t>• Лемма об обработке информации</w:t>
+      </w:r>
+    </w:p>
+    <w:p>
+      <w:pPr>
+        <w:rPr>
+          <w:rFonts w:cs="Segoe UI Symbol"/>
+        </w:rPr>
+      </w:pPr>
+      <w:r>
+        <w:rPr>
+          <w:rFonts w:cs="Segoe UI Symbol"/>
+        </w:rPr>
+        <w:t>– Обработка ухудшает взаимную информацию</w:t>
+      </w:r>
+    </w:p>
+    <w:p>
+      <w:pPr>
+        <w:rPr>
+          <w:rFonts w:cs="Segoe UI Symbol"/>
+        </w:rPr>
+      </w:pPr>
+      <w:r>
+        <w:rPr>
+          <w:rFonts w:cs="Segoe UI Symbol"/>
+        </w:rPr>
+        <w:t>– Применение к системам кодирования и шифрования</w:t>
+      </w:r>
+    </w:p>
+    <w:p>
+      <w:pPr>
+        <w:rPr>
+          <w:rFonts w:cs="Segoe UI Symbol"/>
+        </w:rPr>
+      </w:pPr>
+      <w:r>
+        <w:rPr>
+          <w:rFonts w:cs="Segoe UI Symbol"/>
+        </w:rPr>
+        <w:t>• Будущие темы</w:t>
+      </w:r>
+    </w:p>
+    <w:p>
+      <w:pPr>
+        <w:rPr>
+          <w:rFonts w:cs="Segoe UI Symbol"/>
+        </w:rPr>
+      </w:pPr>
+      <w:r>
+        <w:rPr>
+          <w:rFonts w:cs="Segoe UI Symbol"/>
+        </w:rPr>
+        <w:t>– Доказательство теоремы кодирования</w:t>
+      </w:r>
+    </w:p>
+    <w:p>
+      <w:pPr>
+        <w:rPr>
+          <w:rFonts w:cs="Segoe UI Symbol"/>
+        </w:rPr>
+      </w:pPr>
+      <w:r>
+        <w:rPr>
+          <w:rFonts w:cs="Segoe UI Symbol"/>
+        </w:rPr>
+        <w:t>– Вычисление пропускной способности и изучение кодирования</w:t>
+      </w:r>
+    </w:p>
+    <w:p>
+      <w:pPr>
+        <w:rPr>
+          <w:rFonts w:cs="Segoe UI Symbol"/>
+        </w:rPr>
+      </w:pPr>
+    </w:p>
+    <w:p>
+      <w:pPr>
+        <w:rPr>
+          <w:rFonts w:cs="Segoe UI Symbol"/>
+          <w:sz w:val="32"/>
+          <w:szCs w:val="32"/>
+        </w:rPr>
+      </w:pPr>
+      <w:r>
+        <w:rPr>
+          <w:rFonts w:cs="Segoe UI Symbol"/>
+          <w:sz w:val="32"/>
+          <w:szCs w:val="32"/>
+        </w:rPr>
+        <w:t xml:space="preserve">Лекция </w:t>
+      </w:r>
+      <w:r>
+        <w:rPr>
+          <w:rFonts w:cs="Segoe UI Symbol"/>
+          <w:sz w:val="32"/>
+          <w:szCs w:val="32"/>
+        </w:rPr>
+        <w:t>8</w:t>
+      </w:r>
+    </w:p>
+    <w:p>
+      <w:pPr>
+        <w:rPr>
+          <w:rFonts w:cs="Segoe UI Symbol"/>
+        </w:rPr>
+      </w:pPr>
+      <w:r>
+        <w:rPr>
+          <w:rFonts w:cs="Segoe UI Symbol"/>
+        </w:rPr>
+        <w:t>Теорема кодирования для канала</w:t>
+      </w:r>
+    </w:p>
+    <w:p>
+      <w:pPr>
+        <w:rPr>
+          <w:rFonts w:cs="Segoe UI Symbol"/>
+        </w:rPr>
+      </w:pPr>
+      <w:r>
+        <w:rPr>
+          <w:rFonts w:cs="Segoe UI Symbol"/>
+        </w:rPr>
+        <w:t>– Определяет, как связать скорость передачи информации и вероятность ошибки.</w:t>
+      </w:r>
+    </w:p>
+    <w:p>
+      <w:pPr>
+        <w:rPr>
+          <w:rFonts w:cs="Segoe UI Symbol"/>
+        </w:rPr>
+      </w:pPr>
+      <w:r>
+        <w:rPr>
+          <w:rFonts w:cs="Segoe UI Symbol"/>
+        </w:rPr>
+        <w:t xml:space="preserve">– Говорит о том, </w:t>
       </w:r>
       <w:proofErr w:type="gramStart"/>
       <w:r>
-        <w:t>: Кодировать</w:t>
+        <w:rPr>
+          <w:rFonts w:cs="Segoe UI Symbol"/>
+        </w:rPr>
+        <w:t>что</w:t>
       </w:r>
       <w:proofErr w:type="gramEnd"/>
       <w:r>
-        <w:t xml:space="preserve"> сообщение в двоичное представление.</w:t>
-      </w:r>
-    </w:p>
-    <w:p>
-      <w:r>
-        <w:t xml:space="preserve">   - Ключевое свойство: Каждой букве соответствует кодовое слово фиксированной длины.</w:t>
-      </w:r>
-    </w:p>
-    <w:p/>
-    <w:p>
-      <w:r>
-        <w:t>2. Средняя длина кодового слова</w:t>
-      </w:r>
-    </w:p>
-    <w:p>
-      <w:r>
-        <w:t xml:space="preserve">   - Определение: Средняя длина кодового слова LJT и его вероятность PJT.</w:t>
-      </w:r>
-    </w:p>
-    <w:p>
-      <w:r>
-        <w:t xml:space="preserve">   - Эффективность кодирования: Средняя длина кодового слова больше или равна энтропии источника H от X.</w:t>
-      </w:r>
-    </w:p>
-    <w:p/>
-    <w:p>
-      <w:r>
-        <w:t>3. Алгоритмы кодирования</w:t>
-      </w:r>
-    </w:p>
-    <w:p>
-      <w:r>
-        <w:t xml:space="preserve">   - Построение префиксного кода:</w:t>
-      </w:r>
-    </w:p>
-    <w:p>
-      <w:r>
-        <w:t xml:space="preserve">     - Упорядочивание вероятностей по возрастанию.</w:t>
-      </w:r>
-    </w:p>
-    <w:p>
-      <w:r>
-        <w:t xml:space="preserve">     - Объединение двух наименее вероятных букв в одну вершину дерева.</w:t>
-      </w:r>
-    </w:p>
-    <w:p>
-      <w:r>
-        <w:t xml:space="preserve">     - Повторение процесса до тех пор, пока не останется одна вершина (корень дерева).</w:t>
-      </w:r>
-    </w:p>
-    <w:p>
-      <w:r>
-        <w:t xml:space="preserve">   - Кодирование сообщения:</w:t>
-      </w:r>
-    </w:p>
-    <w:p>
-      <w:r>
-        <w:lastRenderedPageBreak/>
-        <w:t xml:space="preserve">     - Исходное сообщение сопоставляется с </w:t>
-      </w:r>
-      <w:proofErr w:type="spellStart"/>
-      <w:r>
-        <w:t>концовыми</w:t>
-      </w:r>
-      <w:proofErr w:type="spellEnd"/>
-      <w:r>
-        <w:t xml:space="preserve"> вершинами дерева, чтобы получить кодовое слово.</w:t>
-      </w:r>
-    </w:p>
-    <w:p/>
-    <w:p>
-      <w:r>
-        <w:t>4. Декодирование по Хаффману</w:t>
-      </w:r>
-    </w:p>
-    <w:p>
-      <w:r>
-        <w:t xml:space="preserve">   - Процесс: Получение битового потока, который декодируется путем сопоставления с деревом, восстановление оригинального сообщения.</w:t>
-      </w:r>
-    </w:p>
-    <w:p/>
-    <w:p>
-      <w:r>
-        <w:t xml:space="preserve">5. Обобщение — </w:t>
-      </w:r>
-      <w:proofErr w:type="spellStart"/>
-      <w:r>
-        <w:t>Танстоловское</w:t>
-      </w:r>
-      <w:proofErr w:type="spellEnd"/>
-      <w:r>
-        <w:t xml:space="preserve"> кодирование</w:t>
-      </w:r>
-    </w:p>
-    <w:p>
-      <w:r>
-        <w:t xml:space="preserve">   - Цель</w:t>
-      </w:r>
-      <w:proofErr w:type="gramStart"/>
-      <w:r>
-        <w:t>: Закодировать</w:t>
-      </w:r>
-      <w:proofErr w:type="gramEnd"/>
-      <w:r>
-        <w:t xml:space="preserve"> двоичный входной поток в большой алфавит.</w:t>
-      </w:r>
-    </w:p>
-    <w:p>
-      <w:r>
-        <w:t xml:space="preserve">   - Идея</w:t>
-      </w:r>
-      <w:proofErr w:type="gramStart"/>
-      <w:r>
-        <w:t>: Использовать</w:t>
-      </w:r>
-      <w:proofErr w:type="gramEnd"/>
-      <w:r>
-        <w:t xml:space="preserve"> декодирование Хаффмана как кодирование для новой системы, где входные символы преобразуются в двоичные.</w:t>
-      </w:r>
-    </w:p>
-    <w:p/>
-    <w:p>
-      <w:r>
-        <w:t xml:space="preserve">6. Строительство кода </w:t>
-      </w:r>
-      <w:proofErr w:type="spellStart"/>
-      <w:r>
-        <w:t>Танстола</w:t>
-      </w:r>
-      <w:proofErr w:type="spellEnd"/>
-    </w:p>
-    <w:p>
-      <w:r>
-        <w:t xml:space="preserve">   - Алгоритм</w:t>
-      </w:r>
-      <w:proofErr w:type="gramStart"/>
-      <w:r>
-        <w:t>: Строится</w:t>
-      </w:r>
-      <w:proofErr w:type="gramEnd"/>
-      <w:r>
-        <w:t xml:space="preserve"> дерево с равновероятными выходными символами.</w:t>
-      </w:r>
-    </w:p>
-    <w:p>
-      <w:r>
-        <w:t xml:space="preserve">   - Применение</w:t>
-      </w:r>
-      <w:proofErr w:type="gramStart"/>
-      <w:r>
-        <w:t>: Используется</w:t>
-      </w:r>
-      <w:proofErr w:type="gramEnd"/>
-      <w:r>
-        <w:t xml:space="preserve"> для ситуации, когда необходимо перекодировать данные из менее обширного в более обширное представление.</w:t>
-      </w:r>
-    </w:p>
-    <w:p/>
-    <w:p>
-      <w:r>
-        <w:t>7. Арифметическое кодирование</w:t>
-      </w:r>
-    </w:p>
-    <w:p>
-      <w:r>
-        <w:t xml:space="preserve">   - Основная идея</w:t>
-      </w:r>
-      <w:proofErr w:type="gramStart"/>
-      <w:r>
-        <w:t>: Представлять</w:t>
-      </w:r>
-      <w:proofErr w:type="gramEnd"/>
-      <w:r>
-        <w:t xml:space="preserve"> сообщение как интервал на вещественной оси между 0 и 1.</w:t>
-      </w:r>
-    </w:p>
-    <w:p>
-      <w:r>
-        <w:t xml:space="preserve">   - Стратегия</w:t>
-      </w:r>
-      <w:proofErr w:type="gramStart"/>
-      <w:r>
-        <w:t>: Использовать</w:t>
-      </w:r>
-      <w:proofErr w:type="gramEnd"/>
-      <w:r>
-        <w:t xml:space="preserve"> условные вероятности для дробления интервала на </w:t>
-      </w:r>
-      <w:proofErr w:type="spellStart"/>
-      <w:r>
-        <w:t>подинтервалы</w:t>
-      </w:r>
-      <w:proofErr w:type="spellEnd"/>
-      <w:r>
-        <w:t>.</w:t>
-      </w:r>
-    </w:p>
-    <w:p>
-      <w:r>
-        <w:t xml:space="preserve">   - Метод</w:t>
-      </w:r>
-      <w:proofErr w:type="gramStart"/>
-      <w:r>
-        <w:t>: Передать</w:t>
-      </w:r>
-      <w:proofErr w:type="gramEnd"/>
-      <w:r>
-        <w:t xml:space="preserve"> только номер интервала, где находится зашифрованное сообщение.</w:t>
-      </w:r>
-    </w:p>
-    <w:p/>
-    <w:p>
-      <w:r>
-        <w:t>8. Проблемы и недостатки</w:t>
-      </w:r>
-    </w:p>
-    <w:p>
-      <w:r>
-        <w:t xml:space="preserve">   - Сложности в реализации: Важность точности представления чисел при разбиении интервалов.</w:t>
-      </w:r>
-    </w:p>
-    <w:p>
-      <w:r>
-        <w:t xml:space="preserve">   - Проблема накопления вероятностей</w:t>
-      </w:r>
-      <w:proofErr w:type="gramStart"/>
-      <w:r>
-        <w:t>: Требуется</w:t>
-      </w:r>
-      <w:proofErr w:type="gramEnd"/>
-      <w:r>
-        <w:t xml:space="preserve"> обратная связь о статистической модели источника для обеспечения точности.</w:t>
-      </w:r>
-    </w:p>
-    <w:p>
-      <w:r>
-        <w:t xml:space="preserve">   - Ограничения размера алфавита: Априорное знание о вероятностях критично для успешного сжатия данных.</w:t>
-      </w:r>
-    </w:p>
-    <w:p/>
-    <w:p>
-      <w:r>
-        <w:t>9. Заключение</w:t>
-      </w:r>
-    </w:p>
-    <w:p>
-      <w:r>
-        <w:t xml:space="preserve">   - Использование различных кодировок: Как </w:t>
-      </w:r>
-      <w:proofErr w:type="spellStart"/>
-      <w:r>
-        <w:t>Хаффмановские</w:t>
-      </w:r>
-      <w:proofErr w:type="spellEnd"/>
-      <w:r>
-        <w:t xml:space="preserve">, так и </w:t>
-      </w:r>
-      <w:proofErr w:type="spellStart"/>
-      <w:r>
-        <w:t>Танстоловские</w:t>
-      </w:r>
-      <w:proofErr w:type="spellEnd"/>
-      <w:r>
-        <w:t xml:space="preserve"> коды используются в реальных приложениях.</w:t>
-      </w:r>
-    </w:p>
-    <w:p>
-      <w:r>
-        <w:t xml:space="preserve">   - Актуальность арифметического кодирования: Простота и эффективность в современных алгоритмах сжатия.</w:t>
-      </w:r>
-    </w:p>
-    <w:p>
-      <w:r>
-        <w:t xml:space="preserve">   - Необходимость хорошей статистической модели для обеспечения оптимального кодирования. </w:t>
-      </w:r>
-    </w:p>
-    <w:p/>
-    <w:p>
-      <w:r>
-        <w:t>Очередные темы, связанные с передачей данных по каналу, будут рассмотрены на следующих лекциях.</w:t>
+        <w:rPr>
+          <w:rFonts w:cs="Segoe UI Symbol"/>
+        </w:rPr>
+        <w:t xml:space="preserve"> если скорость превышает пропускную способность, вероятность ошибки будет отлична от нуля.</w:t>
+      </w:r>
+    </w:p>
+    <w:p>
+      <w:pPr>
+        <w:rPr>
+          <w:rFonts w:cs="Segoe UI Symbol"/>
+        </w:rPr>
+      </w:pPr>
+    </w:p>
+    <w:p>
+      <w:pPr>
+        <w:rPr>
+          <w:rFonts w:cs="Segoe UI Symbol"/>
+        </w:rPr>
+      </w:pPr>
+      <w:r>
+        <w:rPr>
+          <w:rFonts w:cs="Segoe UI Symbol"/>
+        </w:rPr>
+        <w:t>• Взаимная информация</w:t>
+      </w:r>
+    </w:p>
+    <w:p>
+      <w:pPr>
+        <w:rPr>
+          <w:rFonts w:cs="Segoe UI Symbol"/>
+        </w:rPr>
+      </w:pPr>
+      <w:r>
+        <w:rPr>
+          <w:rFonts w:cs="Segoe UI Symbol"/>
+        </w:rPr>
+        <w:t>– Определяется как разница энтропии между входными и выходными распределениями.</w:t>
+      </w:r>
+    </w:p>
+    <w:p>
+      <w:pPr>
+        <w:rPr>
+          <w:rFonts w:cs="Segoe UI Symbol"/>
+        </w:rPr>
+      </w:pPr>
+      <w:r>
+        <w:rPr>
+          <w:rFonts w:cs="Segoe UI Symbol"/>
+        </w:rPr>
+        <w:t>– Влияет на производительность канала и помогает оценить вероятность ошибки.</w:t>
+      </w:r>
+    </w:p>
+    <w:p>
+      <w:pPr>
+        <w:rPr>
+          <w:rFonts w:cs="Segoe UI Symbol"/>
+        </w:rPr>
+      </w:pPr>
+    </w:p>
+    <w:p>
+      <w:pPr>
+        <w:rPr>
+          <w:rFonts w:cs="Segoe UI Symbol"/>
+        </w:rPr>
+      </w:pPr>
+      <w:r>
+        <w:rPr>
+          <w:rFonts w:cs="Segoe UI Symbol"/>
+        </w:rPr>
+        <w:t>• Пропускная способность канала</w:t>
+      </w:r>
+    </w:p>
+    <w:p>
+      <w:pPr>
+        <w:rPr>
+          <w:rFonts w:cs="Segoe UI Symbol"/>
+        </w:rPr>
+      </w:pPr>
+      <w:r>
+        <w:rPr>
+          <w:rFonts w:cs="Segoe UI Symbol"/>
+        </w:rPr>
+        <w:t>– Максимальная взаимная информация, которая может быть достигнута по всем распределениям входных вероятностей.</w:t>
+      </w:r>
+    </w:p>
+    <w:p>
+      <w:pPr>
+        <w:rPr>
+          <w:rFonts w:cs="Segoe UI Symbol"/>
+        </w:rPr>
+      </w:pPr>
+      <w:r>
+        <w:rPr>
+          <w:rFonts w:cs="Segoe UI Symbol"/>
+        </w:rPr>
+        <w:t>– Вычисляется как максимум по распределению P от X взаимной информации между X и Y.</w:t>
+      </w:r>
+    </w:p>
+    <w:p>
+      <w:pPr>
+        <w:rPr>
+          <w:rFonts w:cs="Segoe UI Symbol"/>
+        </w:rPr>
+      </w:pPr>
+    </w:p>
+    <w:p>
+      <w:pPr>
+        <w:rPr>
+          <w:rFonts w:cs="Segoe UI Symbol"/>
+        </w:rPr>
+      </w:pPr>
+      <w:r>
+        <w:rPr>
+          <w:rFonts w:cs="Segoe UI Symbol"/>
+        </w:rPr>
+        <w:t>• Вероятность ошибки</w:t>
+      </w:r>
+    </w:p>
+    <w:p>
+      <w:pPr>
+        <w:rPr>
+          <w:rFonts w:cs="Segoe UI Symbol"/>
+        </w:rPr>
+      </w:pPr>
+      <w:r>
+        <w:rPr>
+          <w:rFonts w:cs="Segoe UI Symbol"/>
+        </w:rPr>
+        <w:t>– Сумма вероятностей того, что принятый символ не соответствует переданному.</w:t>
+      </w:r>
+    </w:p>
+    <w:p>
+      <w:pPr>
+        <w:rPr>
+          <w:rFonts w:cs="Segoe UI Symbol"/>
+        </w:rPr>
+      </w:pPr>
+      <w:r>
+        <w:rPr>
+          <w:rFonts w:cs="Segoe UI Symbol"/>
+        </w:rPr>
+        <w:t>– Связана с взаимной информацией и оценённая с использованием границы Фоно.</w:t>
+      </w:r>
+    </w:p>
+    <w:p>
+      <w:pPr>
+        <w:rPr>
+          <w:rFonts w:cs="Segoe UI Symbol"/>
+        </w:rPr>
+      </w:pPr>
+      <w:r>
+        <w:rPr>
+          <w:rFonts w:cs="Segoe UI Symbol"/>
+        </w:rPr>
+        <w:t xml:space="preserve">  </w:t>
+      </w:r>
+    </w:p>
+    <w:p>
+      <w:pPr>
+        <w:rPr>
+          <w:rFonts w:cs="Segoe UI Symbol"/>
+        </w:rPr>
+      </w:pPr>
+      <w:r>
+        <w:rPr>
+          <w:rFonts w:cs="Segoe UI Symbol"/>
+        </w:rPr>
+        <w:t>• Построение модели канала</w:t>
+      </w:r>
+    </w:p>
+    <w:p>
+      <w:pPr>
+        <w:rPr>
+          <w:rFonts w:cs="Segoe UI Symbol"/>
+        </w:rPr>
+      </w:pPr>
+      <w:r>
+        <w:rPr>
+          <w:rFonts w:cs="Segoe UI Symbol"/>
+        </w:rPr>
+        <w:t>– Используются входные и выходные алфавиты, матрица переходных вероятностей.</w:t>
+      </w:r>
+    </w:p>
+    <w:p>
+      <w:pPr>
+        <w:rPr>
+          <w:rFonts w:cs="Segoe UI Symbol"/>
+        </w:rPr>
+      </w:pPr>
+      <w:r>
+        <w:rPr>
+          <w:rFonts w:cs="Segoe UI Symbol"/>
+        </w:rPr>
+        <w:t>– Оценка совместной распределительной вероятности для анализа ошибок.</w:t>
+      </w:r>
+    </w:p>
+    <w:p>
+      <w:pPr>
+        <w:rPr>
+          <w:rFonts w:cs="Segoe UI Symbol"/>
+        </w:rPr>
+      </w:pPr>
+    </w:p>
+    <w:p>
+      <w:pPr>
+        <w:rPr>
+          <w:rFonts w:cs="Segoe UI Symbol"/>
+        </w:rPr>
+      </w:pPr>
+      <w:r>
+        <w:rPr>
+          <w:rFonts w:cs="Segoe UI Symbol"/>
+        </w:rPr>
+        <w:t>• Правила принятия решения</w:t>
+      </w:r>
+    </w:p>
+    <w:p>
+      <w:pPr>
+        <w:rPr>
+          <w:rFonts w:cs="Segoe UI Symbol"/>
+        </w:rPr>
+      </w:pPr>
+      <w:r>
+        <w:rPr>
+          <w:rFonts w:cs="Segoe UI Symbol"/>
+        </w:rPr>
+        <w:t>– Оптимизация вероятности правильного решения и минимизация вероятности ошибки.</w:t>
+      </w:r>
+    </w:p>
+    <w:p>
+      <w:pPr>
+        <w:rPr>
+          <w:rFonts w:cs="Segoe UI Symbol"/>
+        </w:rPr>
+      </w:pPr>
+      <w:r>
+        <w:rPr>
+          <w:rFonts w:cs="Segoe UI Symbol"/>
+        </w:rPr>
+        <w:t>– Применяются правила максимального правдоподобия и максимума апостериорной вероятности.</w:t>
+      </w:r>
+    </w:p>
+    <w:p>
+      <w:pPr>
+        <w:rPr>
+          <w:rFonts w:cs="Segoe UI Symbol"/>
+        </w:rPr>
+      </w:pPr>
+    </w:p>
+    <w:p>
+      <w:pPr>
+        <w:rPr>
+          <w:rFonts w:cs="Segoe UI Symbol"/>
+        </w:rPr>
+      </w:pPr>
+      <w:r>
+        <w:rPr>
+          <w:rFonts w:cs="Segoe UI Symbol"/>
+        </w:rPr>
+        <w:t>• Ограничения на распространение информации</w:t>
+      </w:r>
+    </w:p>
+    <w:p>
+      <w:pPr>
+        <w:rPr>
+          <w:rFonts w:cs="Segoe UI Symbol"/>
+        </w:rPr>
+      </w:pPr>
+      <w:r>
+        <w:rPr>
+          <w:rFonts w:cs="Segoe UI Symbol"/>
+        </w:rPr>
+        <w:t>– На скоростях, превышающих пропускную способность, невозможно передавать информацию без ошибок.</w:t>
+      </w:r>
+    </w:p>
+    <w:p>
+      <w:pPr>
+        <w:rPr>
+          <w:rFonts w:cs="Segoe UI Symbol"/>
+        </w:rPr>
+      </w:pPr>
+      <w:r>
+        <w:rPr>
+          <w:rFonts w:cs="Segoe UI Symbol"/>
+        </w:rPr>
+        <w:t>– Установлены верхние границы для достоверной передачи информации.</w:t>
+      </w:r>
+    </w:p>
+    <w:p>
+      <w:pPr>
+        <w:rPr>
+          <w:rFonts w:cs="Segoe UI Symbol"/>
+        </w:rPr>
+      </w:pPr>
+    </w:p>
+    <w:p>
+      <w:pPr>
+        <w:rPr>
+          <w:rFonts w:cs="Segoe UI Symbol"/>
+        </w:rPr>
+      </w:pPr>
+      <w:r>
+        <w:rPr>
+          <w:rFonts w:cs="Segoe UI Symbol"/>
+        </w:rPr>
+        <w:t>• Специальные случаи для вычисления пропускной способности</w:t>
+      </w:r>
+    </w:p>
+    <w:p>
+      <w:pPr>
+        <w:rPr>
+          <w:rFonts w:cs="Segoe UI Symbol"/>
+        </w:rPr>
+      </w:pPr>
+      <w:r>
+        <w:rPr>
+          <w:rFonts w:cs="Segoe UI Symbol"/>
+        </w:rPr>
+        <w:t>– Симметричные каналы: когда строки матрицы переходных вероятностей имеют одинаковую энтропию.</w:t>
+      </w:r>
+    </w:p>
+    <w:p>
+      <w:pPr>
+        <w:rPr>
+          <w:rFonts w:cs="Segoe UI Symbol"/>
+        </w:rPr>
+      </w:pPr>
+      <w:r>
+        <w:rPr>
+          <w:rFonts w:cs="Segoe UI Symbol"/>
+        </w:rPr>
+        <w:t>– Равномерное распределение входных данных позволяет избежать сложных оптимизационных задач.</w:t>
+      </w:r>
+    </w:p>
+    <w:p>
+      <w:pPr>
+        <w:rPr>
+          <w:rFonts w:cs="Segoe UI Symbol"/>
+        </w:rPr>
+      </w:pPr>
+    </w:p>
+    <w:p>
+      <w:pPr>
+        <w:rPr>
+          <w:rFonts w:cs="Segoe UI Symbol"/>
+        </w:rPr>
+      </w:pPr>
+      <w:r>
+        <w:rPr>
+          <w:rFonts w:cs="Segoe UI Symbol"/>
+        </w:rPr>
+        <w:t>• Важность теоремы кодирования</w:t>
+      </w:r>
+    </w:p>
+    <w:p>
+      <w:pPr>
+        <w:rPr>
+          <w:rFonts w:cs="Segoe UI Symbol"/>
+        </w:rPr>
+      </w:pPr>
+      <w:r>
+        <w:rPr>
+          <w:rFonts w:cs="Segoe UI Symbol"/>
+        </w:rPr>
+        <w:t>– Позволяет понять, как различные параметры канала влияют на надежность передачи данных.</w:t>
+      </w:r>
+    </w:p>
+    <w:p>
+      <w:pPr>
+        <w:rPr>
+          <w:rFonts w:cs="Segoe UI Symbol"/>
+        </w:rPr>
+      </w:pPr>
+      <w:r>
+        <w:rPr>
+          <w:rFonts w:cs="Segoe UI Symbol"/>
+        </w:rPr>
+        <w:t>– Является основополагающей в теории информации и связи.</w:t>
+      </w:r>
+      <w:r>
+        <w:rPr>
+          <w:rFonts w:ascii="Segoe UI Symbol" w:hAnsi="Segoe UI Symbol" w:cs="Segoe UI Symbol"/>
+        </w:rPr>
+        <w:t>⁩</w:t>
       </w:r>
     </w:p>
     <w:sectPr>
@@ -1936,7 +3019,7 @@
   <w:style w:type="paragraph" w:default="1" w:styleId="a">
     <w:name w:val="Normal"/>
     <w:qFormat/>
-    <w:rsid w:val="00A37690"/>
+    <w:rsid w:val="00856889"/>
   </w:style>
   <w:style w:type="paragraph" w:styleId="1">
     <w:name w:val="heading 1"/>
@@ -2140,6 +3223,7 @@
   <w:style w:type="character" w:default="1" w:styleId="a0">
     <w:name w:val="Default Paragraph Font"/>
     <w:uiPriority w:val="1"/>
+    <w:semiHidden/>
     <w:unhideWhenUsed/>
   </w:style>
   <w:style w:type="table" w:default="1" w:styleId="a1">

</xml_diff>